<commit_message>
Fix report: CREDIT_SCORE imputation wording and broken Section 6.1 references
</commit_message>
<xml_diff>
--- a/04_Report/AutoGuard_AI_Report_Condensed.docx
+++ b/04_Report/AutoGuard_AI_Report_Condensed.docx
@@ -158,7 +158,7 @@
           <w:sz w:val="21"/>
           <w:szCs w:val="21"/>
         </w:rPr>
-        <w:t xml:space="preserve">The project uses a single authoritative dataset, Car_Insurance_Claim_50000_FINAL.csv, containing 50,000 policyholder records with 19 raw columns. CREDIT_SCORE and ANNUAL_MILEAGE have modest missingness (each under 10%), handled by median imputation; ID values are unique with no fully duplicated rows; 155 rows share an identical feature profile under a different unique ID and are retained as distinct records.</w:t>
+        <w:t>The project uses a single authoritative dataset, Car_Insurance_Claim_50000_FINAL.csv, containing 50,000 policyholder records with 19 raw columns. CREDIT_SCORE and ANNUAL_MILEAGE contain missing values (each under 10%). CREDIT_SCORE is excluded during feature selection, while missing ANNUAL_MILEAGE values used by the final model are handled through median imputation within the preprocessing pipeline; ID values are unique with no fully duplicated rows; 155 rows share an identical feature profile under a different unique ID and are retained as distinct records.</w:t>
       </w:r>
     </w:p>
     <w:p>
@@ -2029,7 +2029,7 @@
           <w:sz w:val="21"/>
           <w:szCs w:val="21"/>
         </w:rPr>
-        <w:t xml:space="preserve">Selection rule: highest Validation ROC-AUC, with F1 breaking ties — selected once, before Test is touched. Random Forest achieved the highest Validation ROC-AUC (0.9324) and was refit on Train + Validation before the single Test evaluation. The ML decision threshold — selected on Validation by sweeping candidate thresholds from 0.05 to 0.95 and maximizing F1 — is 0.35. This answers a purely statistical question, independent of dollar figures; a separate business/economic threshold is derived in Section 6.1.</w:t>
+        <w:t>Selection rule: highest Validation ROC-AUC, with F1 breaking ties — selected once, before Test is touched. Random Forest achieved the highest Validation ROC-AUC (0.9324) and was refit on Train + Validation before the single Test evaluation. The ML decision threshold — selected on Validation by sweeping candidate thresholds from 0.05 to 0.95 and maximizing F1 — is 0.35. This answers a purely statistical question, independent of dollar figures; a separate business/economic threshold is derived in Section 6.</w:t>
       </w:r>
     </w:p>
     <w:p>
@@ -3410,7 +3410,7 @@
           <w:sz w:val="21"/>
           <w:szCs w:val="21"/>
         </w:rPr>
-        <w:t xml:space="preserve">At the ML threshold, the model produced 1,130 false positives (low-risk drivers flagged unnecessarily) and 324 false negatives (claimants missed) out of 10,001 Test records. A false negative — an unpriced claim payout — is typically the costlier mistake, which is why the business threshold (Section 6.1) is set lower than the ML threshold.</w:t>
+        <w:t>At the ML threshold, the model produced 1,130 false positives (low-risk drivers flagged unnecessarily) and 324 false negatives (claimants missed) out of 10,001 Test records. A false negative — an unpriced claim payout — is typically the costlier mistake, which is why the business threshold (Section 6) is set lower than the ML threshold.</w:t>
       </w:r>
     </w:p>
     <w:p>
@@ -4279,7 +4279,7 @@
           <w:sz w:val="21"/>
           <w:szCs w:val="21"/>
         </w:rPr>
-        <w:t xml:space="preserve">The same artifact, 01_ML_Model/model_v2.pkl, is the single source of truth for every serving surface — no separate model is trained for demo versus production use. A standalone Gradio interface (05_Gradio_Interface/gradio_app.py) is an inference-only demo that loads the pipeline via joblib, never calls .fit(), and displays headline metrics read directly from model_v2_metadata.json. The production web interface pairs a FastAPI backend (06_Production_Interface/backend/, exposing /api/v2/quick-predict and /api/v2/health) with a web frontend, integrating a live vehicle-registry lookup and applying the Section 6.1 business policy to produce an operational recommendation alongside the raw claim probability.</w:t>
+        <w:t>The same artifact, 01_ML_Model/model_v2.pkl, is the single source of truth for every serving surface — no separate model is trained for demo versus production use. A standalone Gradio interface (05_Gradio_Interface/gradio_app.py) is an inference-only demo that loads the pipeline via joblib, never calls .fit(), and displays headline metrics read directly from model_v2_metadata.json. The production web interface pairs a FastAPI backend (06_Production_Interface/backend/, exposing /api/v2/quick-predict and /api/v2/health) with a web frontend, integrating a live vehicle-registry lookup and applying the Section 6 business policy to produce an operational recommendation alongside the raw claim probability.</w:t>
       </w:r>
     </w:p>
     <w:tbl>

</xml_diff>